<commit_message>
competitive programming + architecture + applied probability
</commit_message>
<xml_diff>
--- a/16 - Applied Probability/quiz di applied probability.docx
+++ b/16 - Applied Probability/quiz di applied probability.docx
@@ -485,7 +485,99 @@
         <w:t>Quiz 3</w:t>
       </w:r>
     </w:p>
-    <w:p/>
+    <w:p>
+      <w:r>
+        <w:t>Unfortunately, the prof. opened the wrong quiz, this should have been the 4th one. Below are the questions.</w:t>
+      </w:r>
+    </w:p>
+    <w:p>
+      <w:r>
+        <w:lastRenderedPageBreak/>
+        <w:drawing>
+          <wp:inline distT="0" distB="0" distL="0" distR="0" wp14:anchorId="3E1721DE" wp14:editId="1D3485E2">
+            <wp:extent cx="5943600" cy="4849495"/>
+            <wp:effectExtent l="0" t="0" r="0" b="8255"/>
+            <wp:docPr id="1138963281" name="Picture 1" descr="A screenshot of a computer&#10;&#10;AI-generated content may be incorrect."/>
+            <wp:cNvGraphicFramePr>
+              <a:graphicFrameLocks xmlns:a="http://schemas.openxmlformats.org/drawingml/2006/main" noChangeAspect="1"/>
+            </wp:cNvGraphicFramePr>
+            <a:graphic xmlns:a="http://schemas.openxmlformats.org/drawingml/2006/main">
+              <a:graphicData uri="http://schemas.openxmlformats.org/drawingml/2006/picture">
+                <pic:pic xmlns:pic="http://schemas.openxmlformats.org/drawingml/2006/picture">
+                  <pic:nvPicPr>
+                    <pic:cNvPr id="1138963281" name="Picture 1" descr="A screenshot of a computer&#10;&#10;AI-generated content may be incorrect."/>
+                    <pic:cNvPicPr/>
+                  </pic:nvPicPr>
+                  <pic:blipFill>
+                    <a:blip r:embed="rId10"/>
+                    <a:stretch>
+                      <a:fillRect/>
+                    </a:stretch>
+                  </pic:blipFill>
+                  <pic:spPr>
+                    <a:xfrm>
+                      <a:off x="0" y="0"/>
+                      <a:ext cx="5943600" cy="4849495"/>
+                    </a:xfrm>
+                    <a:prstGeom prst="rect">
+                      <a:avLst/>
+                    </a:prstGeom>
+                  </pic:spPr>
+                </pic:pic>
+              </a:graphicData>
+            </a:graphic>
+          </wp:inline>
+        </w:drawing>
+      </w:r>
+    </w:p>
+    <w:p>
+      <w:r>
+        <w:lastRenderedPageBreak/>
+        <w:drawing>
+          <wp:inline distT="0" distB="0" distL="0" distR="0" wp14:anchorId="1B0B4C95" wp14:editId="77396626">
+            <wp:extent cx="5943600" cy="3891915"/>
+            <wp:effectExtent l="0" t="0" r="0" b="0"/>
+            <wp:docPr id="1547468876" name="Picture 1" descr="A screenshot of a math test&#10;&#10;AI-generated content may be incorrect."/>
+            <wp:cNvGraphicFramePr>
+              <a:graphicFrameLocks xmlns:a="http://schemas.openxmlformats.org/drawingml/2006/main" noChangeAspect="1"/>
+            </wp:cNvGraphicFramePr>
+            <a:graphic xmlns:a="http://schemas.openxmlformats.org/drawingml/2006/main">
+              <a:graphicData uri="http://schemas.openxmlformats.org/drawingml/2006/picture">
+                <pic:pic xmlns:pic="http://schemas.openxmlformats.org/drawingml/2006/picture">
+                  <pic:nvPicPr>
+                    <pic:cNvPr id="1547468876" name="Picture 1" descr="A screenshot of a math test&#10;&#10;AI-generated content may be incorrect."/>
+                    <pic:cNvPicPr/>
+                  </pic:nvPicPr>
+                  <pic:blipFill>
+                    <a:blip r:embed="rId11"/>
+                    <a:stretch>
+                      <a:fillRect/>
+                    </a:stretch>
+                  </pic:blipFill>
+                  <pic:spPr>
+                    <a:xfrm>
+                      <a:off x="0" y="0"/>
+                      <a:ext cx="5943600" cy="3891915"/>
+                    </a:xfrm>
+                    <a:prstGeom prst="rect">
+                      <a:avLst/>
+                    </a:prstGeom>
+                  </pic:spPr>
+                </pic:pic>
+              </a:graphicData>
+            </a:graphic>
+          </wp:inline>
+        </w:drawing>
+      </w:r>
+    </w:p>
+    <w:p>
+      <w:pPr>
+        <w:pStyle w:val="Heading2"/>
+      </w:pPr>
+      <w:r>
+        <w:t>Quiz 4</w:t>
+      </w:r>
+    </w:p>
     <w:p/>
     <w:sectPr>
       <w:pgSz w:w="12240" w:h="15840"/>

</xml_diff>